<commit_message>
se agrega botones de entrada y salida al panel de usuario
</commit_message>
<xml_diff>
--- a/documentacion/REQUISITOSFNF.docx
+++ b/documentacion/REQUISITOSFNF.docx
@@ -474,12 +474,14 @@
             <w:r>
               <w:t xml:space="preserve">– </w:t>
             </w:r>
+            <w:proofErr w:type="gramStart"/>
             <w:r>
               <w:t>validar</w:t>
             </w:r>
             <w:r>
-              <w:t xml:space="preserve"> de credenciales</w:t>
-            </w:r>
+              <w:t xml:space="preserve">  credenciales</w:t>
+            </w:r>
+            <w:proofErr w:type="gramEnd"/>
           </w:p>
           <w:p>
             <w:pPr>
@@ -4013,6 +4015,8 @@
         <w:ind w:left="14" w:firstLine="0"/>
         <w:jc w:val="left"/>
       </w:pPr>
+      <w:bookmarkStart w:id="0" w:name="_GoBack"/>
+      <w:bookmarkEnd w:id="0"/>
     </w:p>
     <w:p>
       <w:pPr>
@@ -15361,8 +15365,6 @@
             <w:r>
               <w:t>El sistema podrá generar un reporte de nómina individual para el empleado</w:t>
             </w:r>
-            <w:bookmarkStart w:id="0" w:name="_GoBack"/>
-            <w:bookmarkEnd w:id="0"/>
           </w:p>
         </w:tc>
       </w:tr>

</xml_diff>